<commit_message>
visualize strukturvariablen word skripte
</commit_message>
<xml_diff>
--- a/MeinMaterial/Annahmen und begründete Entscheidungen im Projekt.docx
+++ b/MeinMaterial/Annahmen und begründete Entscheidungen im Projekt.docx
@@ -18,6 +18,19 @@
       <w:r>
         <w:t>Linke mit in Andere gejoinded: Es wurde visuell abgecheckt, dass sich keine Flüsse aufheben</w:t>
       </w:r>
+      <w:r>
+        <w:br/>
+        <w:t>12% Hürde, keine exits/entries</w:t>
+      </w:r>
+      <w:r>
+        <w:br/>
+      </w:r>
+      <w:r>
+        <w:t>Evaluation_Ökologische_Inf_ …) seite 1</w:t>
+      </w:r>
+      <w:r>
+        <w:t>8 (bessere schätzung, weniger parteien/zellen zu schätzen</w:t>
+      </w:r>
     </w:p>
     <w:p>
       <w:pPr>
@@ -30,6 +43,29 @@
       <w:r>
         <w:t>Möglichst kleinräumige Aggregationen begründet durch bessere Schätzungen anhand des Evaluationspaper (kleinste erfasste differenzierbare Einheiten mind. auf Gemeindeebene aufgrund der Strukturdaten)</w:t>
       </w:r>
+      <w:r>
+        <w:br/>
+        <w:t>zitieren Gschwend seite 6/11 unten</w:t>
+      </w:r>
+      <w:r>
+        <w:br/>
+        <w:t>mehr units-&gt; bessere schätzung (Evaluation_Ökologische_Inf_ …) seite 13</w:t>
+      </w:r>
+      <w:r>
+        <w:t>, ausführlicher seite 16</w:t>
+      </w:r>
+      <w:r>
+        <w:t>, nslphom_dual.pdf seite 18 unten</w:t>
+      </w:r>
+      <w:r>
+        <w:t xml:space="preserve"> (mehr units heißt auch höhere computational burden </w:t>
+      </w:r>
+      <w:r>
+        <w:t>(nslphom_dual.pdf seite 17)</w:t>
+      </w:r>
+      <w:r>
+        <w:t>)</w:t>
+      </w:r>
     </w:p>
     <w:p>
       <w:pPr>
@@ -64,12 +100,42 @@
         <w:t>Reduktion auf 12% Hürde:</w:t>
       </w:r>
       <w:r>
+        <w:t xml:space="preserve"> (</w:t>
+      </w:r>
+      <w:r>
+        <w:t>nslphom_dual.pdf</w:t>
+      </w:r>
+      <w:r>
+        <w:t xml:space="preserve"> seite 17)</w:t>
+      </w:r>
+      <w:r>
         <w:br/>
         <w:t>1) computational weniger intensiv</w:t>
       </w:r>
       <w:r>
         <w:br/>
-        <w:t>2) evaluationspaper: besser/genauer bei weniger Kategorien</w:t>
+        <w:t>2) evaluationspaper</w:t>
+      </w:r>
+      <w:r>
+        <w:t xml:space="preserve"> (</w:t>
+      </w:r>
+      <w:r>
+        <w:t>Evaluation_Ökologische_Inf_ …</w:t>
+      </w:r>
+      <w:r>
+        <w:t xml:space="preserve"> seite 18</w:t>
+      </w:r>
+      <w:r>
+        <w:t xml:space="preserve">) </w:t>
+      </w:r>
+      <w:r>
+        <w:t>: besser/genauer bei weniger Kategorien</w:t>
+      </w:r>
+      <w:r>
+        <w:t xml:space="preserve"> (weniger overfitting?? Vllt auch nicht, mein gedanke der überprüft werden sollte)</w:t>
+      </w:r>
+      <w:r>
+        <w:t>, nslphom_dual.pdf seite 18 unten</w:t>
       </w:r>
     </w:p>
     <w:p>
@@ -91,6 +157,15 @@
         <w:br/>
         <w:t>2) am robustesten laut evaluations/nslphom Paper</w:t>
       </w:r>
+      <w:r>
+        <w:t xml:space="preserve"> (Seite 13 Evaluation_Ökologische_Inf_ … Paper, robuster als ei_manual modell, nach ei_manual beste EI werte, seite 14</w:t>
+      </w:r>
+      <w:r>
+        <w:t>, seite 22 oben</w:t>
+      </w:r>
+      <w:r>
+        <w:t>)</w:t>
+      </w:r>
     </w:p>
     <w:p>
       <w:pPr>
@@ -101,11 +176,40 @@
         </w:numPr>
       </w:pPr>
       <w:r>
-        <w:t>Regression:</w:t>
-      </w:r>
-      <w:r>
+        <w:t xml:space="preserve">Nslphom_dual: besser meistens als nslphom </w:t>
+      </w:r>
+      <w:r>
+        <w:t xml:space="preserve">(seite 15 unten, 16 oben) </w:t>
+      </w:r>
+      <w:r>
+        <w:t>(asymmetrisch siehe seite 2): nslphom_dual.pdf</w:t>
+      </w:r>
+    </w:p>
+    <w:p>
+      <w:pPr>
+        <w:pStyle w:val="Listenabsatz"/>
+        <w:rPr>
+          <w:lang w:val="en-US"/>
+        </w:rPr>
+      </w:pPr>
+      <w:r>
+        <w:rPr>
+          <w:lang w:val="en-US"/>
+        </w:rPr>
+        <w:t>Seite 8: HETe gewichtete Aggregation der 2 nslphom Läufe</w:t>
+      </w:r>
+      <w:r>
+        <w:rPr>
+          <w:lang w:val="en-US"/>
+        </w:rPr>
         <w:br/>
-        <w:t>möglichst einfach gehalten -&gt; INTERPRETATIONsmöglichkeit</w:t>
+        <w:t xml:space="preserve">Seite 18: </w:t>
+      </w:r>
+      <w:r>
+        <w:rPr>
+          <w:lang w:val="en-US"/>
+        </w:rPr>
+        <w:t xml:space="preserve">factors impacting on the accuracy of the estimates </w:t>
       </w:r>
     </w:p>
     <w:p>
@@ -117,53 +221,11 @@
         </w:numPr>
       </w:pPr>
       <w:r>
-        <w:t>Nur Osten: Berlin raus, rein, nur Ostteil rein</w:t>
-      </w:r>
-      <w:r>
-        <w:t xml:space="preserve"> </w:t>
-      </w:r>
-      <w:r>
-        <w:t>(Problem</w:t>
-      </w:r>
-      <w:r>
-        <w:t xml:space="preserve"> Datenlage:</w:t>
-      </w:r>
-      <w:r>
-        <w:t xml:space="preserve"> Strukturvariablen nur für gesamtberlin</w:t>
-      </w:r>
-      <w:r>
-        <w:t>, Aggregationsbias vermeiden</w:t>
-      </w:r>
-      <w:r>
-        <w:t>)</w:t>
+        <w:t>Regression:</w:t>
       </w:r>
       <w:r>
         <w:br/>
-        <w:t xml:space="preserve">(mit berlin wäre es: </w:t>
-      </w:r>
-      <w:r>
-        <w:t>Osten-Split: ostdeutschland =</w:t>
-      </w:r>
-      <w:r>
-        <w:t xml:space="preserve"> </w:t>
-      </w:r>
-      <w:r>
-        <w:t>substr(agg_schluessel, 1, 2) %in% c("12", "13", "14", "15", "16") |</w:t>
-      </w:r>
-      <w:r>
-        <w:t xml:space="preserve"> </w:t>
-      </w:r>
-      <w:r>
-        <w:t>substr(agg_schluessel, 1, 3) == "111" # mit Berlin, bis jetzt ausgeschlossen</w:t>
-      </w:r>
-      <w:r>
-        <w:t xml:space="preserve"> </w:t>
-      </w:r>
-      <w:r>
-        <w:t>mit Ostberlin (111)</w:t>
-      </w:r>
-      <w:r>
-        <w:t>)</w:t>
+        <w:t>möglichst einfach gehalten -&gt; INTERPRETATIONsmöglichkeit</w:t>
       </w:r>
     </w:p>
     <w:p>
@@ -175,11 +237,35 @@
         </w:numPr>
       </w:pPr>
       <w:r>
-        <w:t>Keine Differenzen wegen Datenlage:</w:t>
+        <w:t>Nur Osten: Berlin raus, rein, nur Ostteil rein (Problem Datenlage: Strukturvariablen nur für gesamtberlin, Aggregationsbias vermeiden)</w:t>
       </w:r>
       <w:r>
         <w:br/>
-        <w:t>andere Quellen schwierig (Gemeindeebene, über 2 verschiedene jahre erfasst, am besten gleiche Quelle für vergleichbarkeit. Keine Daten. Möglich wäre: Pendler)</w:t>
+        <w:t xml:space="preserve">(mit berlin wäre es: </w:t>
+      </w:r>
+      <w:r>
+        <w:t>Osten-Split: ostdeutschland =</w:t>
+      </w:r>
+      <w:r>
+        <w:t xml:space="preserve"> </w:t>
+      </w:r>
+      <w:r>
+        <w:t>substr(agg_schluessel, 1, 2) %in% c("12", "13", "14", "15", "16") |</w:t>
+      </w:r>
+      <w:r>
+        <w:t xml:space="preserve"> </w:t>
+      </w:r>
+      <w:r>
+        <w:t>substr(agg_schluessel, 1, 3) == "111" # mit Berlin, bis jetzt ausgeschlossen</w:t>
+      </w:r>
+      <w:r>
+        <w:t xml:space="preserve"> </w:t>
+      </w:r>
+      <w:r>
+        <w:t>mit Ostberlin (111)</w:t>
+      </w:r>
+      <w:r>
+        <w:t>)</w:t>
       </w:r>
     </w:p>
     <w:p>
@@ -191,7 +277,11 @@
         </w:numPr>
       </w:pPr>
       <w:r>
-        <w:t>Spatial modell nur sinn bei einem übergang regressiert</w:t>
+        <w:t>Keine Differenzen wegen Datenlage:</w:t>
+      </w:r>
+      <w:r>
+        <w:br/>
+        <w:t>andere Quellen schwierig (Gemeindeebene, über 2 verschiedene jahre erfasst, am besten gleiche Quelle für vergleichbarkeit. Keine Daten. Möglich wäre: Pendler)</w:t>
       </w:r>
     </w:p>
     <w:p>
@@ -202,6 +292,158 @@
           <w:numId w:val="1"/>
         </w:numPr>
       </w:pPr>
+      <w:r>
+        <w:t>Spatial modell nur sinn bei einem übergang regressiert</w:t>
+      </w:r>
+    </w:p>
+    <w:p>
+      <w:pPr>
+        <w:pStyle w:val="Listenabsatz"/>
+        <w:numPr>
+          <w:ilvl w:val="0"/>
+          <w:numId w:val="1"/>
+        </w:numPr>
+      </w:pPr>
+      <w:r>
+        <w:t>Iter_max=3 aufgrund von optimum in der nslphom_dual fit</w:t>
+      </w:r>
+      <w:r>
+        <w:br/>
+        <w:t>iter_max niedrig verhindert auch besser komplettes overfitting als hohes iter_max</w:t>
+      </w:r>
+    </w:p>
+    <w:p>
+      <w:pPr>
+        <w:pStyle w:val="Listenabsatz"/>
+        <w:numPr>
+          <w:ilvl w:val="0"/>
+          <w:numId w:val="1"/>
+        </w:numPr>
+      </w:pPr>
+      <w:r>
+        <w:t>Bootstrap zur Unsicherheits (Standard Errors) einschätzung (ab seite 5 unten (nur für ökologische Inferenz ohne regression) Paper: Estimation of voter transitions and the ecological fallacy)</w:t>
+      </w:r>
+    </w:p>
+    <w:p>
+      <w:pPr>
+        <w:pStyle w:val="Listenabsatz"/>
+        <w:numPr>
+          <w:ilvl w:val="0"/>
+          <w:numId w:val="1"/>
+        </w:numPr>
+      </w:pPr>
+      <w:r>
+        <w:t xml:space="preserve">Ecological bias kann minimiert werden durch anwendung ökologischer Inferenz in Verbindung mit Kovariablen (seite 6 </w:t>
+      </w:r>
+      <w:r>
+        <w:t xml:space="preserve">Paper: Estimation of voter transitions and the </w:t>
+      </w:r>
+      <w:r>
+        <w:lastRenderedPageBreak/>
+        <w:t>ecological fallacy)</w:t>
+      </w:r>
+      <w:r>
+        <w:br/>
+        <w:t>nicht möglich bei uns, da uns der Effekt der Kovariablen interessiert und man ja die Kovariablen nicht miteinbeziehen kann in die Übergangsschätzung und danach Zusammenhang von Übergangsschätzung und Kovariablen betrachten kann. Würde nicht den tatsächlichen Zusammenhang in der Bevölkerung darstellen.</w:t>
+      </w:r>
+    </w:p>
+    <w:p>
+      <w:pPr>
+        <w:pStyle w:val="Listenabsatz"/>
+        <w:numPr>
+          <w:ilvl w:val="0"/>
+          <w:numId w:val="1"/>
+        </w:numPr>
+      </w:pPr>
+      <w:r>
+        <w:t xml:space="preserve">HetE ist nur bester Modellvalidierungswert den wir kriegen, denn </w:t>
+      </w:r>
+      <w:r>
+        <w:t>exakt reproduzierte Wahlränder keine korrekten Individualübergänge garantieren und wie unbeobachtete Heterogenität Verzerrungen erzeugt.</w:t>
+      </w:r>
+      <w:r>
+        <w:br/>
+        <w:t>Estimation of voter transitions and the ecological fallacy.pdf</w:t>
+      </w:r>
+    </w:p>
+    <w:p>
+      <w:pPr>
+        <w:pStyle w:val="Listenabsatz"/>
+        <w:numPr>
+          <w:ilvl w:val="0"/>
+          <w:numId w:val="1"/>
+        </w:numPr>
+        <w:rPr>
+          <w:lang w:val="en-US"/>
+        </w:rPr>
+      </w:pPr>
+      <w:r>
+        <w:rPr>
+          <w:lang w:val="en-US"/>
+        </w:rPr>
+        <w:t>Standardisierung Kovariablen</w:t>
+      </w:r>
+      <w:r>
+        <w:rPr>
+          <w:lang w:val="en-US"/>
+        </w:rPr>
+        <w:br/>
+      </w:r>
+      <w:r>
+        <w:rPr>
+          <w:lang w:val="en-US"/>
+        </w:rPr>
+        <w:t xml:space="preserve">In order to facilitate the interpretation of the estimated coefficients and the relative impact of </w:t>
+      </w:r>
+      <w:r>
+        <w:rPr>
+          <w:lang w:val="en-US"/>
+        </w:rPr>
+        <w:t xml:space="preserve"> </w:t>
+      </w:r>
+      <w:r>
+        <w:rPr>
+          <w:lang w:val="en-US"/>
+        </w:rPr>
+        <w:t>their associated features on accuracy, all the explanatory variables have been standardized t</w:t>
+      </w:r>
+      <w:r>
+        <w:rPr>
+          <w:lang w:val="en-US"/>
+        </w:rPr>
+        <w:t xml:space="preserve">o </w:t>
+      </w:r>
+      <w:r>
+        <w:rPr>
+          <w:lang w:val="en-US"/>
+        </w:rPr>
+        <w:t>zero mean and standard deviation 1. In this way, each estimated coefficient informs about the expected variation from the mean in the response variable due to one standard variation in the corresponding variable.</w:t>
+      </w:r>
+      <w:r>
+        <w:rPr>
+          <w:lang w:val="en-US"/>
+        </w:rPr>
+        <w:br/>
+        <w:t>nslphom_dual seite 20</w:t>
+      </w:r>
+    </w:p>
+    <w:p>
+      <w:pPr>
+        <w:pStyle w:val="Listenabsatz"/>
+        <w:numPr>
+          <w:ilvl w:val="0"/>
+          <w:numId w:val="1"/>
+        </w:numPr>
+        <w:rPr>
+          <w:lang w:val="en-US"/>
+        </w:rPr>
+      </w:pPr>
+      <w:r>
+        <w:rPr>
+          <w:lang w:val="en-US"/>
+        </w:rPr>
+        <w:t>OSQP Einstellungen seite 2 osqp.pdf</w:t>
+      </w:r>
     </w:p>
     <w:sectPr>
       <w:pgSz w:w="11906" w:h="16838"/>

</xml_diff>

<commit_message>
nrurd paper, durchgelaufenes osqp validierung, neue to dos, überarbeiteter erstentwurf BA
</commit_message>
<xml_diff>
--- a/MeinMaterial/Annahmen und begründete Entscheidungen im Projekt.docx
+++ b/MeinMaterial/Annahmen und begründete Entscheidungen im Projekt.docx
@@ -24,12 +24,7 @@
       </w:r>
       <w:r>
         <w:br/>
-      </w:r>
-      <w:r>
-        <w:t>Evaluation_Ökologische_Inf_ …) seite 1</w:t>
-      </w:r>
-      <w:r>
-        <w:t>8 (bessere schätzung, weniger parteien/zellen zu schätzen</w:t>
+        <w:t>Evaluation_Ökologische_Inf_ …) seite 18 (bessere schätzung, weniger parteien/zellen zu schätzen</w:t>
       </w:r>
     </w:p>
     <w:p>
@@ -58,10 +53,7 @@
         <w:t>, nslphom_dual.pdf seite 18 unten</w:t>
       </w:r>
       <w:r>
-        <w:t xml:space="preserve"> (mehr units heißt auch höhere computational burden </w:t>
-      </w:r>
-      <w:r>
-        <w:t>(nslphom_dual.pdf seite 17)</w:t>
+        <w:t xml:space="preserve"> (mehr units heißt auch höhere computational burden (nslphom_dual.pdf seite 17)</w:t>
       </w:r>
       <w:r>
         <w:t>)</w:t>
@@ -100,13 +92,7 @@
         <w:t>Reduktion auf 12% Hürde:</w:t>
       </w:r>
       <w:r>
-        <w:t xml:space="preserve"> (</w:t>
-      </w:r>
-      <w:r>
-        <w:t>nslphom_dual.pdf</w:t>
-      </w:r>
-      <w:r>
-        <w:t xml:space="preserve"> seite 17)</w:t>
+        <w:t xml:space="preserve"> (nslphom_dual.pdf seite 17)</w:t>
       </w:r>
       <w:r>
         <w:br/>
@@ -117,16 +103,7 @@
         <w:t>2) evaluationspaper</w:t>
       </w:r>
       <w:r>
-        <w:t xml:space="preserve"> (</w:t>
-      </w:r>
-      <w:r>
-        <w:t>Evaluation_Ökologische_Inf_ …</w:t>
-      </w:r>
-      <w:r>
-        <w:t xml:space="preserve"> seite 18</w:t>
-      </w:r>
-      <w:r>
-        <w:t xml:space="preserve">) </w:t>
+        <w:t xml:space="preserve"> (Evaluation_Ökologische_Inf_ … seite 18) </w:t>
       </w:r>
       <w:r>
         <w:t>: besser/genauer bei weniger Kategorien</w:t>
@@ -203,13 +180,7 @@
           <w:lang w:val="en-US"/>
         </w:rPr>
         <w:br/>
-        <w:t xml:space="preserve">Seite 18: </w:t>
-      </w:r>
-      <w:r>
-        <w:rPr>
-          <w:lang w:val="en-US"/>
-        </w:rPr>
-        <w:t xml:space="preserve">factors impacting on the accuracy of the estimates </w:t>
+        <w:t xml:space="preserve">Seite 18: factors impacting on the accuracy of the estimates </w:t>
       </w:r>
     </w:p>
     <w:p>
@@ -333,10 +304,7 @@
         </w:numPr>
       </w:pPr>
       <w:r>
-        <w:t xml:space="preserve">Ecological bias kann minimiert werden durch anwendung ökologischer Inferenz in Verbindung mit Kovariablen (seite 6 </w:t>
-      </w:r>
-      <w:r>
-        <w:t xml:space="preserve">Paper: Estimation of voter transitions and the </w:t>
+        <w:t xml:space="preserve">Ecological bias kann minimiert werden durch anwendung ökologischer Inferenz in Verbindung mit Kovariablen (seite 6 Paper: Estimation of voter transitions and the </w:t>
       </w:r>
       <w:r>
         <w:lastRenderedPageBreak/>
@@ -388,11 +356,6 @@
           <w:lang w:val="en-US"/>
         </w:rPr>
         <w:br/>
-      </w:r>
-      <w:r>
-        <w:rPr>
-          <w:lang w:val="en-US"/>
-        </w:rPr>
         <w:t xml:space="preserve">In order to facilitate the interpretation of the estimated coefficients and the relative impact of </w:t>
       </w:r>
       <w:r>
@@ -443,6 +406,21 @@
           <w:lang w:val="en-US"/>
         </w:rPr>
         <w:t>OSQP Einstellungen seite 2 osqp.pdf</w:t>
+      </w:r>
+    </w:p>
+    <w:p>
+      <w:pPr>
+        <w:pStyle w:val="Listenabsatz"/>
+        <w:numPr>
+          <w:ilvl w:val="0"/>
+          <w:numId w:val="1"/>
+        </w:numPr>
+      </w:pPr>
+      <w:r>
+        <w:t>Leverage Points: verzerren schätzung (zu v</w:t>
+      </w:r>
+      <w:r>
+        <w:t>iel einfluss auf schätzung) siehe s.11 unten confounders_ei_history.pdf</w:t>
       </w:r>
     </w:p>
     <w:sectPr>
@@ -1179,6 +1157,7 @@
   <w:style w:type="character" w:default="1" w:styleId="Absatz-Standardschriftart">
     <w:name w:val="Default Paragraph Font"/>
     <w:uiPriority w:val="1"/>
+    <w:semiHidden/>
     <w:unhideWhenUsed/>
   </w:style>
   <w:style w:type="table" w:default="1" w:styleId="NormaleTabelle">

</xml_diff>

<commit_message>
neudurchlauf Linke/Grüne neue Literatur tomographie plot
</commit_message>
<xml_diff>
--- a/MeinMaterial/Annahmen und begründete Entscheidungen im Projekt.docx
+++ b/MeinMaterial/Annahmen und begründete Entscheidungen im Projekt.docx
@@ -16,15 +16,75 @@
         </w:numPr>
       </w:pPr>
       <w:r>
-        <w:t>Linke mit in Andere gejoinded: Es wurde visuell abgecheckt, dass sich keine Flüsse aufheben</w:t>
+        <w:t xml:space="preserve">Linke mit in Andere </w:t>
+      </w:r>
+      <w:proofErr w:type="spellStart"/>
+      <w:r>
+        <w:t>gejoinded</w:t>
+      </w:r>
+      <w:proofErr w:type="spellEnd"/>
+      <w:r>
+        <w:t>: Es wurde visuell abgecheckt, dass sich keine Flüsse aufheben</w:t>
       </w:r>
       <w:r>
         <w:br/>
-        <w:t>12% Hürde, keine exits/entries</w:t>
-      </w:r>
+        <w:t xml:space="preserve">12% Hürde, keine </w:t>
+      </w:r>
+      <w:proofErr w:type="spellStart"/>
+      <w:r>
+        <w:t>exits</w:t>
+      </w:r>
+      <w:proofErr w:type="spellEnd"/>
+      <w:r>
+        <w:t>/</w:t>
+      </w:r>
+      <w:proofErr w:type="spellStart"/>
+      <w:r>
+        <w:t>entries</w:t>
+      </w:r>
+      <w:proofErr w:type="spellEnd"/>
       <w:r>
         <w:br/>
-        <w:t>Evaluation_Ökologische_Inf_ …) seite 18 (bessere schätzung, weniger parteien/zellen zu schätzen</w:t>
+      </w:r>
+      <w:proofErr w:type="spellStart"/>
+      <w:r>
+        <w:t>Evaluation_Ökologische_Inf</w:t>
+      </w:r>
+      <w:proofErr w:type="spellEnd"/>
+      <w:r>
+        <w:t xml:space="preserve">_ …) </w:t>
+      </w:r>
+      <w:proofErr w:type="spellStart"/>
+      <w:r>
+        <w:t>seite</w:t>
+      </w:r>
+      <w:proofErr w:type="spellEnd"/>
+      <w:r>
+        <w:t xml:space="preserve"> 18 (bessere </w:t>
+      </w:r>
+      <w:proofErr w:type="spellStart"/>
+      <w:r>
+        <w:t>schätzung</w:t>
+      </w:r>
+      <w:proofErr w:type="spellEnd"/>
+      <w:r>
+        <w:t xml:space="preserve">, weniger </w:t>
+      </w:r>
+      <w:proofErr w:type="spellStart"/>
+      <w:r>
+        <w:t>parteien</w:t>
+      </w:r>
+      <w:proofErr w:type="spellEnd"/>
+      <w:r>
+        <w:t>/</w:t>
+      </w:r>
+      <w:proofErr w:type="spellStart"/>
+      <w:r>
+        <w:t>zellen</w:t>
+      </w:r>
+      <w:proofErr w:type="spellEnd"/>
+      <w:r>
+        <w:t xml:space="preserve"> zu schätzen</w:t>
       </w:r>
     </w:p>
     <w:p>
@@ -40,20 +100,108 @@
       </w:r>
       <w:r>
         <w:br/>
-        <w:t>zitieren Gschwend seite 6/11 unten</w:t>
+        <w:t xml:space="preserve">zitieren Gschwend </w:t>
+      </w:r>
+      <w:proofErr w:type="spellStart"/>
+      <w:r>
+        <w:t>seite</w:t>
+      </w:r>
+      <w:proofErr w:type="spellEnd"/>
+      <w:r>
+        <w:t xml:space="preserve"> 6/11 unten</w:t>
       </w:r>
       <w:r>
         <w:br/>
-        <w:t>mehr units-&gt; bessere schätzung (Evaluation_Ökologische_Inf_ …) seite 13</w:t>
-      </w:r>
-      <w:r>
-        <w:t>, ausführlicher seite 16</w:t>
-      </w:r>
-      <w:r>
-        <w:t>, nslphom_dual.pdf seite 18 unten</w:t>
-      </w:r>
-      <w:r>
-        <w:t xml:space="preserve"> (mehr units heißt auch höhere computational burden (nslphom_dual.pdf seite 17)</w:t>
+        <w:t xml:space="preserve">mehr </w:t>
+      </w:r>
+      <w:proofErr w:type="spellStart"/>
+      <w:r>
+        <w:t>units</w:t>
+      </w:r>
+      <w:proofErr w:type="spellEnd"/>
+      <w:r>
+        <w:t xml:space="preserve">-&gt; bessere </w:t>
+      </w:r>
+      <w:proofErr w:type="spellStart"/>
+      <w:r>
+        <w:t>schätzung</w:t>
+      </w:r>
+      <w:proofErr w:type="spellEnd"/>
+      <w:r>
+        <w:t xml:space="preserve"> (</w:t>
+      </w:r>
+      <w:proofErr w:type="spellStart"/>
+      <w:r>
+        <w:t>Evaluation_Ökologische_Inf</w:t>
+      </w:r>
+      <w:proofErr w:type="spellEnd"/>
+      <w:r>
+        <w:t xml:space="preserve">_ …) </w:t>
+      </w:r>
+      <w:proofErr w:type="spellStart"/>
+      <w:r>
+        <w:t>seite</w:t>
+      </w:r>
+      <w:proofErr w:type="spellEnd"/>
+      <w:r>
+        <w:t xml:space="preserve"> 13</w:t>
+      </w:r>
+      <w:r>
+        <w:t xml:space="preserve">, ausführlicher </w:t>
+      </w:r>
+      <w:proofErr w:type="spellStart"/>
+      <w:r>
+        <w:t>seite</w:t>
+      </w:r>
+      <w:proofErr w:type="spellEnd"/>
+      <w:r>
+        <w:t xml:space="preserve"> 16</w:t>
+      </w:r>
+      <w:r>
+        <w:t xml:space="preserve">, nslphom_dual.pdf </w:t>
+      </w:r>
+      <w:proofErr w:type="spellStart"/>
+      <w:r>
+        <w:t>seite</w:t>
+      </w:r>
+      <w:proofErr w:type="spellEnd"/>
+      <w:r>
+        <w:t xml:space="preserve"> 18 unten</w:t>
+      </w:r>
+      <w:r>
+        <w:t xml:space="preserve"> (mehr </w:t>
+      </w:r>
+      <w:proofErr w:type="spellStart"/>
+      <w:r>
+        <w:t>units</w:t>
+      </w:r>
+      <w:proofErr w:type="spellEnd"/>
+      <w:r>
+        <w:t xml:space="preserve"> heißt auch höhere </w:t>
+      </w:r>
+      <w:proofErr w:type="spellStart"/>
+      <w:r>
+        <w:t>computational</w:t>
+      </w:r>
+      <w:proofErr w:type="spellEnd"/>
+      <w:r>
+        <w:t xml:space="preserve"> </w:t>
+      </w:r>
+      <w:proofErr w:type="spellStart"/>
+      <w:r>
+        <w:t>burden</w:t>
+      </w:r>
+      <w:proofErr w:type="spellEnd"/>
+      <w:r>
+        <w:t xml:space="preserve"> (nslphom_dual.pdf </w:t>
+      </w:r>
+      <w:proofErr w:type="spellStart"/>
+      <w:r>
+        <w:t>seite</w:t>
+      </w:r>
+      <w:proofErr w:type="spellEnd"/>
+      <w:r>
+        <w:t xml:space="preserve"> 17)</w:t>
       </w:r>
       <w:r>
         <w:t>)</w:t>
@@ -68,7 +216,23 @@
         </w:numPr>
       </w:pPr>
       <w:r>
-        <w:t>Exits und entries in nslphom nicht berücksichtigt, da sehr schlechter Schätzer</w:t>
+        <w:t xml:space="preserve">Exits und </w:t>
+      </w:r>
+      <w:proofErr w:type="spellStart"/>
+      <w:r>
+        <w:t>entries</w:t>
+      </w:r>
+      <w:proofErr w:type="spellEnd"/>
+      <w:r>
+        <w:t xml:space="preserve"> in </w:t>
+      </w:r>
+      <w:proofErr w:type="spellStart"/>
+      <w:r>
+        <w:t>nslphom</w:t>
+      </w:r>
+      <w:proofErr w:type="spellEnd"/>
+      <w:r>
+        <w:t xml:space="preserve"> nicht berücksichtigt, da sehr schlechter Schätzer</w:t>
       </w:r>
       <w:r>
         <w:br/>
@@ -92,27 +256,96 @@
         <w:t>Reduktion auf 12% Hürde:</w:t>
       </w:r>
       <w:r>
-        <w:t xml:space="preserve"> (nslphom_dual.pdf seite 17)</w:t>
+        <w:t xml:space="preserve"> (nslphom_dual.pdf </w:t>
+      </w:r>
+      <w:proofErr w:type="spellStart"/>
+      <w:r>
+        <w:t>seite</w:t>
+      </w:r>
+      <w:proofErr w:type="spellEnd"/>
+      <w:r>
+        <w:t xml:space="preserve"> 17)</w:t>
       </w:r>
       <w:r>
         <w:br/>
-        <w:t>1) computational weniger intensiv</w:t>
+        <w:t xml:space="preserve">1) </w:t>
+      </w:r>
+      <w:proofErr w:type="spellStart"/>
+      <w:r>
+        <w:t>computational</w:t>
+      </w:r>
+      <w:proofErr w:type="spellEnd"/>
+      <w:r>
+        <w:t xml:space="preserve"> weniger intensiv</w:t>
       </w:r>
       <w:r>
         <w:br/>
-        <w:t>2) evaluationspaper</w:t>
-      </w:r>
-      <w:r>
-        <w:t xml:space="preserve"> (Evaluation_Ökologische_Inf_ … seite 18) </w:t>
+        <w:t xml:space="preserve">2) </w:t>
+      </w:r>
+      <w:proofErr w:type="spellStart"/>
+      <w:r>
+        <w:t>evaluationspaper</w:t>
+      </w:r>
+      <w:proofErr w:type="spellEnd"/>
+      <w:r>
+        <w:t xml:space="preserve"> (</w:t>
+      </w:r>
+      <w:proofErr w:type="spellStart"/>
+      <w:r>
+        <w:t>Evaluation_Ökologische_Inf</w:t>
+      </w:r>
+      <w:proofErr w:type="spellEnd"/>
+      <w:r>
+        <w:t xml:space="preserve">_ … </w:t>
+      </w:r>
+      <w:proofErr w:type="spellStart"/>
+      <w:r>
+        <w:t>seite</w:t>
+      </w:r>
+      <w:proofErr w:type="spellEnd"/>
+      <w:r>
+        <w:t xml:space="preserve"> 18) </w:t>
       </w:r>
       <w:r>
         <w:t>: besser/genauer bei weniger Kategorien</w:t>
       </w:r>
       <w:r>
-        <w:t xml:space="preserve"> (weniger overfitting?? Vllt auch nicht, mein gedanke der überprüft werden sollte)</w:t>
-      </w:r>
-      <w:r>
-        <w:t>, nslphom_dual.pdf seite 18 unten</w:t>
+        <w:t xml:space="preserve"> (weniger </w:t>
+      </w:r>
+      <w:proofErr w:type="spellStart"/>
+      <w:r>
+        <w:t>overfitting</w:t>
+      </w:r>
+      <w:proofErr w:type="spellEnd"/>
+      <w:r>
+        <w:t xml:space="preserve">?? </w:t>
+      </w:r>
+      <w:proofErr w:type="spellStart"/>
+      <w:r>
+        <w:t>Vllt</w:t>
+      </w:r>
+      <w:proofErr w:type="spellEnd"/>
+      <w:r>
+        <w:t xml:space="preserve"> auch nicht, mein </w:t>
+      </w:r>
+      <w:proofErr w:type="spellStart"/>
+      <w:r>
+        <w:t>gedanke</w:t>
+      </w:r>
+      <w:proofErr w:type="spellEnd"/>
+      <w:r>
+        <w:t xml:space="preserve"> der überprüft werden sollte)</w:t>
+      </w:r>
+      <w:r>
+        <w:t xml:space="preserve">, nslphom_dual.pdf </w:t>
+      </w:r>
+      <w:proofErr w:type="spellStart"/>
+      <w:r>
+        <w:t>seite</w:t>
+      </w:r>
+      <w:proofErr w:type="spellEnd"/>
+      <w:r>
+        <w:t xml:space="preserve"> 18 unten</w:t>
       </w:r>
     </w:p>
     <w:p>
@@ -124,7 +357,15 @@
         </w:numPr>
       </w:pPr>
       <w:r>
-        <w:t>Entscheidung für nslphom:</w:t>
+        <w:t xml:space="preserve">Entscheidung für </w:t>
+      </w:r>
+      <w:proofErr w:type="spellStart"/>
+      <w:r>
+        <w:t>nslphom</w:t>
+      </w:r>
+      <w:proofErr w:type="spellEnd"/>
+      <w:r>
+        <w:t>:</w:t>
       </w:r>
       <w:r>
         <w:br/>
@@ -132,13 +373,77 @@
       </w:r>
       <w:r>
         <w:br/>
-        <w:t>2) am robustesten laut evaluations/nslphom Paper</w:t>
-      </w:r>
-      <w:r>
-        <w:t xml:space="preserve"> (Seite 13 Evaluation_Ökologische_Inf_ … Paper, robuster als ei_manual modell, nach ei_manual beste EI werte, seite 14</w:t>
-      </w:r>
-      <w:r>
-        <w:t>, seite 22 oben</w:t>
+        <w:t xml:space="preserve">2) am robustesten laut </w:t>
+      </w:r>
+      <w:proofErr w:type="spellStart"/>
+      <w:r>
+        <w:t>evaluations</w:t>
+      </w:r>
+      <w:proofErr w:type="spellEnd"/>
+      <w:r>
+        <w:t>/</w:t>
+      </w:r>
+      <w:proofErr w:type="spellStart"/>
+      <w:r>
+        <w:t>nslphom</w:t>
+      </w:r>
+      <w:proofErr w:type="spellEnd"/>
+      <w:r>
+        <w:t xml:space="preserve"> Paper</w:t>
+      </w:r>
+      <w:r>
+        <w:t xml:space="preserve"> (Seite 13 </w:t>
+      </w:r>
+      <w:proofErr w:type="spellStart"/>
+      <w:r>
+        <w:t>Evaluation_Ökologische_Inf</w:t>
+      </w:r>
+      <w:proofErr w:type="spellEnd"/>
+      <w:r>
+        <w:t xml:space="preserve">_ … Paper, robuster als </w:t>
+      </w:r>
+      <w:proofErr w:type="spellStart"/>
+      <w:r>
+        <w:t>ei_manual</w:t>
+      </w:r>
+      <w:proofErr w:type="spellEnd"/>
+      <w:r>
+        <w:t xml:space="preserve"> </w:t>
+      </w:r>
+      <w:proofErr w:type="spellStart"/>
+      <w:r>
+        <w:t>modell</w:t>
+      </w:r>
+      <w:proofErr w:type="spellEnd"/>
+      <w:r>
+        <w:t xml:space="preserve">, nach </w:t>
+      </w:r>
+      <w:proofErr w:type="spellStart"/>
+      <w:r>
+        <w:t>ei_manual</w:t>
+      </w:r>
+      <w:proofErr w:type="spellEnd"/>
+      <w:r>
+        <w:t xml:space="preserve"> beste EI werte, </w:t>
+      </w:r>
+      <w:proofErr w:type="spellStart"/>
+      <w:r>
+        <w:t>seite</w:t>
+      </w:r>
+      <w:proofErr w:type="spellEnd"/>
+      <w:r>
+        <w:t xml:space="preserve"> 14</w:t>
+      </w:r>
+      <w:r>
+        <w:t xml:space="preserve">, </w:t>
+      </w:r>
+      <w:proofErr w:type="spellStart"/>
+      <w:r>
+        <w:t>seite</w:t>
+      </w:r>
+      <w:proofErr w:type="spellEnd"/>
+      <w:r>
+        <w:t xml:space="preserve"> 22 oben</w:t>
       </w:r>
       <w:r>
         <w:t>)</w:t>
@@ -152,14 +457,43 @@
           <w:numId w:val="1"/>
         </w:numPr>
       </w:pPr>
-      <w:r>
-        <w:t xml:space="preserve">Nslphom_dual: besser meistens als nslphom </w:t>
-      </w:r>
-      <w:r>
-        <w:t xml:space="preserve">(seite 15 unten, 16 oben) </w:t>
-      </w:r>
-      <w:r>
-        <w:t>(asymmetrisch siehe seite 2): nslphom_dual.pdf</w:t>
+      <w:proofErr w:type="spellStart"/>
+      <w:r>
+        <w:t>Nslphom_dual</w:t>
+      </w:r>
+      <w:proofErr w:type="spellEnd"/>
+      <w:r>
+        <w:t xml:space="preserve">: besser meistens als </w:t>
+      </w:r>
+      <w:proofErr w:type="spellStart"/>
+      <w:r>
+        <w:t>nslphom</w:t>
+      </w:r>
+      <w:proofErr w:type="spellEnd"/>
+      <w:r>
+        <w:t xml:space="preserve"> </w:t>
+      </w:r>
+      <w:r>
+        <w:t>(</w:t>
+      </w:r>
+      <w:proofErr w:type="spellStart"/>
+      <w:r>
+        <w:t>seite</w:t>
+      </w:r>
+      <w:proofErr w:type="spellEnd"/>
+      <w:r>
+        <w:t xml:space="preserve"> 15 unten, 16 oben) </w:t>
+      </w:r>
+      <w:r>
+        <w:t xml:space="preserve">(asymmetrisch siehe </w:t>
+      </w:r>
+      <w:proofErr w:type="spellStart"/>
+      <w:r>
+        <w:t>seite</w:t>
+      </w:r>
+      <w:proofErr w:type="spellEnd"/>
+      <w:r>
+        <w:t xml:space="preserve"> 2): nslphom_dual.pdf</w:t>
       </w:r>
     </w:p>
     <w:p>
@@ -169,18 +503,89 @@
           <w:lang w:val="en-US"/>
         </w:rPr>
       </w:pPr>
-      <w:r>
-        <w:rPr>
-          <w:lang w:val="en-US"/>
-        </w:rPr>
-        <w:t>Seite 8: HETe gewichtete Aggregation der 2 nslphom Läufe</w:t>
-      </w:r>
+      <w:proofErr w:type="spellStart"/>
+      <w:r>
+        <w:rPr>
+          <w:lang w:val="en-US"/>
+        </w:rPr>
+        <w:t>Seite</w:t>
+      </w:r>
+      <w:proofErr w:type="spellEnd"/>
+      <w:r>
+        <w:rPr>
+          <w:lang w:val="en-US"/>
+        </w:rPr>
+        <w:t xml:space="preserve"> 8: </w:t>
+      </w:r>
+      <w:proofErr w:type="spellStart"/>
+      <w:r>
+        <w:rPr>
+          <w:lang w:val="en-US"/>
+        </w:rPr>
+        <w:t>HETe</w:t>
+      </w:r>
+      <w:proofErr w:type="spellEnd"/>
+      <w:r>
+        <w:rPr>
+          <w:lang w:val="en-US"/>
+        </w:rPr>
+        <w:t xml:space="preserve"> </w:t>
+      </w:r>
+      <w:proofErr w:type="spellStart"/>
+      <w:r>
+        <w:rPr>
+          <w:lang w:val="en-US"/>
+        </w:rPr>
+        <w:t>gewichtete</w:t>
+      </w:r>
+      <w:proofErr w:type="spellEnd"/>
+      <w:r>
+        <w:rPr>
+          <w:lang w:val="en-US"/>
+        </w:rPr>
+        <w:t xml:space="preserve"> Aggregation der 2 </w:t>
+      </w:r>
+      <w:proofErr w:type="spellStart"/>
+      <w:r>
+        <w:rPr>
+          <w:lang w:val="en-US"/>
+        </w:rPr>
+        <w:t>nslphom</w:t>
+      </w:r>
+      <w:proofErr w:type="spellEnd"/>
+      <w:r>
+        <w:rPr>
+          <w:lang w:val="en-US"/>
+        </w:rPr>
+        <w:t xml:space="preserve"> </w:t>
+      </w:r>
+      <w:proofErr w:type="spellStart"/>
+      <w:r>
+        <w:rPr>
+          <w:lang w:val="en-US"/>
+        </w:rPr>
+        <w:t>Läufe</w:t>
+      </w:r>
+      <w:proofErr w:type="spellEnd"/>
       <w:r>
         <w:rPr>
           <w:lang w:val="en-US"/>
         </w:rPr>
         <w:br/>
-        <w:t xml:space="preserve">Seite 18: factors impacting on the accuracy of the estimates </w:t>
+      </w:r>
+      <w:proofErr w:type="spellStart"/>
+      <w:r>
+        <w:rPr>
+          <w:lang w:val="en-US"/>
+        </w:rPr>
+        <w:t>Seite</w:t>
+      </w:r>
+      <w:proofErr w:type="spellEnd"/>
+      <w:r>
+        <w:rPr>
+          <w:lang w:val="en-US"/>
+        </w:rPr>
+        <w:t xml:space="preserve"> 18: factors impacting on the accuracy of the estimates </w:t>
       </w:r>
     </w:p>
     <w:p>
@@ -196,8 +601,13 @@
       </w:r>
       <w:r>
         <w:br/>
-        <w:t>möglichst einfach gehalten -&gt; INTERPRETATIONsmöglichkeit</w:t>
-      </w:r>
+        <w:t xml:space="preserve">möglichst einfach gehalten -&gt; </w:t>
+      </w:r>
+      <w:proofErr w:type="spellStart"/>
+      <w:r>
+        <w:t>INTERPRETATIONsmöglichkeit</w:t>
+      </w:r>
+      <w:proofErr w:type="spellEnd"/>
     </w:p>
     <w:p>
       <w:pPr>
@@ -208,26 +618,76 @@
         </w:numPr>
       </w:pPr>
       <w:r>
-        <w:t>Nur Osten: Berlin raus, rein, nur Ostteil rein (Problem Datenlage: Strukturvariablen nur für gesamtberlin, Aggregationsbias vermeiden)</w:t>
+        <w:t xml:space="preserve">Nur Osten: Berlin raus, rein, nur Ostteil rein (Problem Datenlage: Strukturvariablen nur für </w:t>
+      </w:r>
+      <w:proofErr w:type="spellStart"/>
+      <w:r>
+        <w:t>gesamtberlin</w:t>
+      </w:r>
+      <w:proofErr w:type="spellEnd"/>
+      <w:r>
+        <w:t>, Aggregationsbias vermeiden)</w:t>
       </w:r>
       <w:r>
         <w:br/>
-        <w:t xml:space="preserve">(mit berlin wäre es: </w:t>
-      </w:r>
-      <w:r>
-        <w:t>Osten-Split: ostdeutschland =</w:t>
+        <w:t xml:space="preserve">(mit </w:t>
+      </w:r>
+      <w:proofErr w:type="spellStart"/>
+      <w:r>
+        <w:t>berlin</w:t>
+      </w:r>
+      <w:proofErr w:type="spellEnd"/>
+      <w:r>
+        <w:t xml:space="preserve"> wäre es: </w:t>
+      </w:r>
+      <w:r>
+        <w:t xml:space="preserve">Osten-Split: </w:t>
+      </w:r>
+      <w:proofErr w:type="spellStart"/>
+      <w:r>
+        <w:t>ostdeutschland</w:t>
+      </w:r>
+      <w:proofErr w:type="spellEnd"/>
+      <w:r>
+        <w:t xml:space="preserve"> =</w:t>
       </w:r>
       <w:r>
         <w:t xml:space="preserve"> </w:t>
       </w:r>
-      <w:r>
-        <w:t>substr(agg_schluessel, 1, 2) %in% c("12", "13", "14", "15", "16") |</w:t>
+      <w:proofErr w:type="spellStart"/>
+      <w:r>
+        <w:t>substr</w:t>
+      </w:r>
+      <w:proofErr w:type="spellEnd"/>
+      <w:r>
+        <w:t>(</w:t>
+      </w:r>
+      <w:proofErr w:type="spellStart"/>
+      <w:r>
+        <w:t>agg_schluessel</w:t>
+      </w:r>
+      <w:proofErr w:type="spellEnd"/>
+      <w:r>
+        <w:t>, 1, 2) %in% c("12", "13", "14", "15", "16") |</w:t>
       </w:r>
       <w:r>
         <w:t xml:space="preserve"> </w:t>
       </w:r>
-      <w:r>
-        <w:t>substr(agg_schluessel, 1, 3) == "111" # mit Berlin, bis jetzt ausgeschlossen</w:t>
+      <w:proofErr w:type="spellStart"/>
+      <w:r>
+        <w:t>substr</w:t>
+      </w:r>
+      <w:proofErr w:type="spellEnd"/>
+      <w:r>
+        <w:t>(</w:t>
+      </w:r>
+      <w:proofErr w:type="spellStart"/>
+      <w:r>
+        <w:t>agg_schluessel</w:t>
+      </w:r>
+      <w:proofErr w:type="spellEnd"/>
+      <w:r>
+        <w:t>, 1, 3) == "111" # mit Berlin, bis jetzt ausgeschlossen</w:t>
       </w:r>
       <w:r>
         <w:t xml:space="preserve"> </w:t>
@@ -252,7 +712,23 @@
       </w:r>
       <w:r>
         <w:br/>
-        <w:t>andere Quellen schwierig (Gemeindeebene, über 2 verschiedene jahre erfasst, am besten gleiche Quelle für vergleichbarkeit. Keine Daten. Möglich wäre: Pendler)</w:t>
+        <w:t xml:space="preserve">andere Quellen schwierig (Gemeindeebene, über 2 verschiedene </w:t>
+      </w:r>
+      <w:proofErr w:type="spellStart"/>
+      <w:r>
+        <w:t>jahre</w:t>
+      </w:r>
+      <w:proofErr w:type="spellEnd"/>
+      <w:r>
+        <w:t xml:space="preserve"> erfasst, am besten gleiche Quelle für </w:t>
+      </w:r>
+      <w:proofErr w:type="spellStart"/>
+      <w:r>
+        <w:t>vergleichbarkeit</w:t>
+      </w:r>
+      <w:proofErr w:type="spellEnd"/>
+      <w:r>
+        <w:t>. Keine Daten. Möglich wäre: Pendler)</w:t>
       </w:r>
     </w:p>
     <w:p>
@@ -263,8 +739,29 @@
           <w:numId w:val="1"/>
         </w:numPr>
       </w:pPr>
-      <w:r>
-        <w:t>Spatial modell nur sinn bei einem übergang regressiert</w:t>
+      <w:proofErr w:type="spellStart"/>
+      <w:r>
+        <w:t>Spatial</w:t>
+      </w:r>
+      <w:proofErr w:type="spellEnd"/>
+      <w:r>
+        <w:t xml:space="preserve"> </w:t>
+      </w:r>
+      <w:proofErr w:type="spellStart"/>
+      <w:r>
+        <w:t>modell</w:t>
+      </w:r>
+      <w:proofErr w:type="spellEnd"/>
+      <w:r>
+        <w:t xml:space="preserve"> nur sinn bei einem </w:t>
+      </w:r>
+      <w:proofErr w:type="spellStart"/>
+      <w:r>
+        <w:t>übergang</w:t>
+      </w:r>
+      <w:proofErr w:type="spellEnd"/>
+      <w:r>
+        <w:t xml:space="preserve"> regressiert</w:t>
       </w:r>
     </w:p>
     <w:p>
@@ -275,13 +772,54 @@
           <w:numId w:val="1"/>
         </w:numPr>
       </w:pPr>
-      <w:r>
-        <w:t>Iter_max=3 aufgrund von optimum in der nslphom_dual fit</w:t>
+      <w:proofErr w:type="spellStart"/>
+      <w:r>
+        <w:t>Iter_max</w:t>
+      </w:r>
+      <w:proofErr w:type="spellEnd"/>
+      <w:r>
+        <w:t xml:space="preserve">=3 aufgrund von </w:t>
+      </w:r>
+      <w:proofErr w:type="spellStart"/>
+      <w:r>
+        <w:t>optimum</w:t>
+      </w:r>
+      <w:proofErr w:type="spellEnd"/>
+      <w:r>
+        <w:t xml:space="preserve"> in der </w:t>
+      </w:r>
+      <w:proofErr w:type="spellStart"/>
+      <w:r>
+        <w:t>nslphom_dual</w:t>
+      </w:r>
+      <w:proofErr w:type="spellEnd"/>
+      <w:r>
+        <w:t xml:space="preserve"> fit</w:t>
       </w:r>
       <w:r>
         <w:br/>
-        <w:t>iter_max niedrig verhindert auch besser komplettes overfitting als hohes iter_max</w:t>
-      </w:r>
+      </w:r>
+      <w:proofErr w:type="spellStart"/>
+      <w:r>
+        <w:t>iter_max</w:t>
+      </w:r>
+      <w:proofErr w:type="spellEnd"/>
+      <w:r>
+        <w:t xml:space="preserve"> niedrig verhindert auch besser komplettes </w:t>
+      </w:r>
+      <w:proofErr w:type="spellStart"/>
+      <w:r>
+        <w:t>overfitting</w:t>
+      </w:r>
+      <w:proofErr w:type="spellEnd"/>
+      <w:r>
+        <w:t xml:space="preserve"> als hohes </w:t>
+      </w:r>
+      <w:proofErr w:type="spellStart"/>
+      <w:r>
+        <w:t>iter_max</w:t>
+      </w:r>
+      <w:proofErr w:type="spellEnd"/>
     </w:p>
     <w:p>
       <w:pPr>
@@ -292,7 +830,79 @@
         </w:numPr>
       </w:pPr>
       <w:r>
-        <w:t>Bootstrap zur Unsicherheits (Standard Errors) einschätzung (ab seite 5 unten (nur für ökologische Inferenz ohne regression) Paper: Estimation of voter transitions and the ecological fallacy)</w:t>
+        <w:t xml:space="preserve">Bootstrap zur </w:t>
+      </w:r>
+      <w:proofErr w:type="spellStart"/>
+      <w:r>
+        <w:t>Unsicherheits</w:t>
+      </w:r>
+      <w:proofErr w:type="spellEnd"/>
+      <w:r>
+        <w:t xml:space="preserve"> (Standard Errors) </w:t>
+      </w:r>
+      <w:proofErr w:type="spellStart"/>
+      <w:r>
+        <w:t>einschätzung</w:t>
+      </w:r>
+      <w:proofErr w:type="spellEnd"/>
+      <w:r>
+        <w:t xml:space="preserve"> (ab </w:t>
+      </w:r>
+      <w:proofErr w:type="spellStart"/>
+      <w:r>
+        <w:t>seite</w:t>
+      </w:r>
+      <w:proofErr w:type="spellEnd"/>
+      <w:r>
+        <w:t xml:space="preserve"> 5 unten (nur für ökologische Inferenz ohne </w:t>
+      </w:r>
+      <w:proofErr w:type="spellStart"/>
+      <w:r>
+        <w:t>regression</w:t>
+      </w:r>
+      <w:proofErr w:type="spellEnd"/>
+      <w:r>
+        <w:t xml:space="preserve">) Paper: </w:t>
+      </w:r>
+      <w:proofErr w:type="spellStart"/>
+      <w:r>
+        <w:t>Estimation</w:t>
+      </w:r>
+      <w:proofErr w:type="spellEnd"/>
+      <w:r>
+        <w:t xml:space="preserve"> of </w:t>
+      </w:r>
+      <w:proofErr w:type="spellStart"/>
+      <w:r>
+        <w:t>voter</w:t>
+      </w:r>
+      <w:proofErr w:type="spellEnd"/>
+      <w:r>
+        <w:t xml:space="preserve"> </w:t>
+      </w:r>
+      <w:proofErr w:type="spellStart"/>
+      <w:r>
+        <w:t>transitions</w:t>
+      </w:r>
+      <w:proofErr w:type="spellEnd"/>
+      <w:r>
+        <w:t xml:space="preserve"> and the </w:t>
+      </w:r>
+      <w:proofErr w:type="spellStart"/>
+      <w:r>
+        <w:t>ecological</w:t>
+      </w:r>
+      <w:proofErr w:type="spellEnd"/>
+      <w:r>
+        <w:t xml:space="preserve"> </w:t>
+      </w:r>
+      <w:proofErr w:type="spellStart"/>
+      <w:r>
+        <w:t>fallacy</w:t>
+      </w:r>
+      <w:proofErr w:type="spellEnd"/>
+      <w:r>
+        <w:t>)</w:t>
       </w:r>
     </w:p>
     <w:p>
@@ -303,12 +913,78 @@
           <w:numId w:val="1"/>
         </w:numPr>
       </w:pPr>
-      <w:r>
-        <w:t xml:space="preserve">Ecological bias kann minimiert werden durch anwendung ökologischer Inferenz in Verbindung mit Kovariablen (seite 6 Paper: Estimation of voter transitions and the </w:t>
-      </w:r>
+      <w:proofErr w:type="spellStart"/>
+      <w:r>
+        <w:t>Ecological</w:t>
+      </w:r>
+      <w:proofErr w:type="spellEnd"/>
+      <w:r>
+        <w:t xml:space="preserve"> </w:t>
+      </w:r>
+      <w:proofErr w:type="spellStart"/>
+      <w:r>
+        <w:t>bias</w:t>
+      </w:r>
+      <w:proofErr w:type="spellEnd"/>
+      <w:r>
+        <w:t xml:space="preserve"> kann minimiert werden durch </w:t>
+      </w:r>
+      <w:proofErr w:type="spellStart"/>
+      <w:r>
+        <w:t>anwendung</w:t>
+      </w:r>
+      <w:proofErr w:type="spellEnd"/>
+      <w:r>
+        <w:t xml:space="preserve"> ökologischer Inferenz in Verbindung mit Kovariablen (</w:t>
+      </w:r>
+      <w:proofErr w:type="spellStart"/>
+      <w:r>
+        <w:t>seite</w:t>
+      </w:r>
+      <w:proofErr w:type="spellEnd"/>
+      <w:r>
+        <w:t xml:space="preserve"> 6 Paper: </w:t>
+      </w:r>
+      <w:proofErr w:type="spellStart"/>
+      <w:r>
+        <w:t>Estimation</w:t>
+      </w:r>
+      <w:proofErr w:type="spellEnd"/>
+      <w:r>
+        <w:t xml:space="preserve"> of </w:t>
+      </w:r>
+      <w:proofErr w:type="spellStart"/>
+      <w:r>
+        <w:t>voter</w:t>
+      </w:r>
+      <w:proofErr w:type="spellEnd"/>
+      <w:r>
+        <w:t xml:space="preserve"> </w:t>
+      </w:r>
+      <w:proofErr w:type="spellStart"/>
+      <w:r>
+        <w:t>transitions</w:t>
+      </w:r>
+      <w:proofErr w:type="spellEnd"/>
+      <w:r>
+        <w:t xml:space="preserve"> and the </w:t>
+      </w:r>
+      <w:proofErr w:type="spellStart"/>
       <w:r>
         <w:lastRenderedPageBreak/>
-        <w:t>ecological fallacy)</w:t>
+        <w:t>ecological</w:t>
+      </w:r>
+      <w:proofErr w:type="spellEnd"/>
+      <w:r>
+        <w:t xml:space="preserve"> </w:t>
+      </w:r>
+      <w:proofErr w:type="spellStart"/>
+      <w:r>
+        <w:t>fallacy</w:t>
+      </w:r>
+      <w:proofErr w:type="spellEnd"/>
+      <w:r>
+        <w:t>)</w:t>
       </w:r>
       <w:r>
         <w:br/>
@@ -323,15 +999,51 @@
           <w:numId w:val="1"/>
         </w:numPr>
       </w:pPr>
-      <w:r>
-        <w:t xml:space="preserve">HetE ist nur bester Modellvalidierungswert den wir kriegen, denn </w:t>
+      <w:proofErr w:type="spellStart"/>
+      <w:r>
+        <w:t>HetE</w:t>
+      </w:r>
+      <w:proofErr w:type="spellEnd"/>
+      <w:r>
+        <w:t xml:space="preserve"> ist nur bester Modellvalidierungswert den wir kriegen, denn </w:t>
       </w:r>
       <w:r>
         <w:t>exakt reproduzierte Wahlränder keine korrekten Individualübergänge garantieren und wie unbeobachtete Heterogenität Verzerrungen erzeugt.</w:t>
       </w:r>
       <w:r>
         <w:br/>
-        <w:t>Estimation of voter transitions and the ecological fallacy.pdf</w:t>
+      </w:r>
+      <w:proofErr w:type="spellStart"/>
+      <w:r>
+        <w:t>Estimation</w:t>
+      </w:r>
+      <w:proofErr w:type="spellEnd"/>
+      <w:r>
+        <w:t xml:space="preserve"> of </w:t>
+      </w:r>
+      <w:proofErr w:type="spellStart"/>
+      <w:r>
+        <w:t>voter</w:t>
+      </w:r>
+      <w:proofErr w:type="spellEnd"/>
+      <w:r>
+        <w:t xml:space="preserve"> </w:t>
+      </w:r>
+      <w:proofErr w:type="spellStart"/>
+      <w:r>
+        <w:t>transitions</w:t>
+      </w:r>
+      <w:proofErr w:type="spellEnd"/>
+      <w:r>
+        <w:t xml:space="preserve"> and the </w:t>
+      </w:r>
+      <w:proofErr w:type="spellStart"/>
+      <w:r>
+        <w:t>ecological</w:t>
+      </w:r>
+      <w:proofErr w:type="spellEnd"/>
+      <w:r>
+        <w:t xml:space="preserve"> fallacy.pdf</w:t>
       </w:r>
     </w:p>
     <w:p>
@@ -345,12 +1057,28 @@
           <w:lang w:val="en-US"/>
         </w:rPr>
       </w:pPr>
-      <w:r>
-        <w:rPr>
-          <w:lang w:val="en-US"/>
-        </w:rPr>
-        <w:t>Standardisierung Kovariablen</w:t>
-      </w:r>
+      <w:proofErr w:type="spellStart"/>
+      <w:r>
+        <w:rPr>
+          <w:lang w:val="en-US"/>
+        </w:rPr>
+        <w:t>Standardisierung</w:t>
+      </w:r>
+      <w:proofErr w:type="spellEnd"/>
+      <w:r>
+        <w:rPr>
+          <w:lang w:val="en-US"/>
+        </w:rPr>
+        <w:t xml:space="preserve"> </w:t>
+      </w:r>
+      <w:proofErr w:type="spellStart"/>
+      <w:r>
+        <w:rPr>
+          <w:lang w:val="en-US"/>
+        </w:rPr>
+        <w:t>Kovariablen</w:t>
+      </w:r>
+      <w:proofErr w:type="spellEnd"/>
       <w:r>
         <w:rPr>
           <w:lang w:val="en-US"/>
@@ -387,7 +1115,34 @@
           <w:lang w:val="en-US"/>
         </w:rPr>
         <w:br/>
-        <w:t>nslphom_dual seite 20</w:t>
+      </w:r>
+      <w:proofErr w:type="spellStart"/>
+      <w:r>
+        <w:rPr>
+          <w:lang w:val="en-US"/>
+        </w:rPr>
+        <w:t>nslphom_dual</w:t>
+      </w:r>
+      <w:proofErr w:type="spellEnd"/>
+      <w:r>
+        <w:rPr>
+          <w:lang w:val="en-US"/>
+        </w:rPr>
+        <w:t xml:space="preserve"> </w:t>
+      </w:r>
+      <w:proofErr w:type="spellStart"/>
+      <w:r>
+        <w:rPr>
+          <w:lang w:val="en-US"/>
+        </w:rPr>
+        <w:t>seite</w:t>
+      </w:r>
+      <w:proofErr w:type="spellEnd"/>
+      <w:r>
+        <w:rPr>
+          <w:lang w:val="en-US"/>
+        </w:rPr>
+        <w:t xml:space="preserve"> 20</w:t>
       </w:r>
     </w:p>
     <w:p>
@@ -405,7 +1160,35 @@
         <w:rPr>
           <w:lang w:val="en-US"/>
         </w:rPr>
-        <w:t>OSQP Einstellungen seite 2 osqp.pdf</w:t>
+        <w:t xml:space="preserve">OSQP </w:t>
+      </w:r>
+      <w:proofErr w:type="spellStart"/>
+      <w:r>
+        <w:rPr>
+          <w:lang w:val="en-US"/>
+        </w:rPr>
+        <w:t>Einstellungen</w:t>
+      </w:r>
+      <w:proofErr w:type="spellEnd"/>
+      <w:r>
+        <w:rPr>
+          <w:lang w:val="en-US"/>
+        </w:rPr>
+        <w:t xml:space="preserve"> </w:t>
+      </w:r>
+      <w:proofErr w:type="spellStart"/>
+      <w:r>
+        <w:rPr>
+          <w:lang w:val="en-US"/>
+        </w:rPr>
+        <w:t>seite</w:t>
+      </w:r>
+      <w:proofErr w:type="spellEnd"/>
+      <w:r>
+        <w:rPr>
+          <w:lang w:val="en-US"/>
+        </w:rPr>
+        <w:t xml:space="preserve"> 2 osqp.pdf</w:t>
       </w:r>
     </w:p>
     <w:p>
@@ -417,10 +1200,113 @@
         </w:numPr>
       </w:pPr>
       <w:r>
-        <w:t>Leverage Points: verzerren schätzung (zu v</w:t>
-      </w:r>
-      <w:r>
-        <w:t>iel einfluss auf schätzung) siehe s.11 unten confounders_ei_history.pdf</w:t>
+        <w:t xml:space="preserve">Leverage Points: verzerren </w:t>
+      </w:r>
+      <w:proofErr w:type="spellStart"/>
+      <w:r>
+        <w:t>schätzung</w:t>
+      </w:r>
+      <w:proofErr w:type="spellEnd"/>
+      <w:r>
+        <w:t xml:space="preserve"> (zu v</w:t>
+      </w:r>
+      <w:r>
+        <w:t xml:space="preserve">iel </w:t>
+      </w:r>
+      <w:proofErr w:type="spellStart"/>
+      <w:r>
+        <w:t>einfluss</w:t>
+      </w:r>
+      <w:proofErr w:type="spellEnd"/>
+      <w:r>
+        <w:t xml:space="preserve"> auf </w:t>
+      </w:r>
+      <w:proofErr w:type="spellStart"/>
+      <w:r>
+        <w:t>schätzung</w:t>
+      </w:r>
+      <w:proofErr w:type="spellEnd"/>
+      <w:r>
+        <w:t>) siehe s.11 unten confounders_ei_history.pdf</w:t>
+      </w:r>
+    </w:p>
+    <w:p>
+      <w:pPr>
+        <w:pStyle w:val="Listenabsatz"/>
+        <w:numPr>
+          <w:ilvl w:val="0"/>
+          <w:numId w:val="1"/>
+        </w:numPr>
+      </w:pPr>
+      <w:r>
+        <w:t xml:space="preserve">Berlin ausschließen: Andere </w:t>
+      </w:r>
+      <w:proofErr w:type="spellStart"/>
+      <w:r>
+        <w:t>strukturen</w:t>
+      </w:r>
+      <w:proofErr w:type="spellEnd"/>
+      <w:r>
+        <w:t xml:space="preserve"> erwartet (</w:t>
+      </w:r>
+      <w:r>
+        <w:t xml:space="preserve">große </w:t>
+      </w:r>
+      <w:proofErr w:type="spellStart"/>
+      <w:r>
+        <w:t>heterogenität</w:t>
+      </w:r>
+      <w:proofErr w:type="spellEnd"/>
+      <w:r>
+        <w:t xml:space="preserve"> innerhalb </w:t>
+      </w:r>
+      <w:proofErr w:type="spellStart"/>
+      <w:r>
+        <w:t>berlin</w:t>
+      </w:r>
+      <w:proofErr w:type="spellEnd"/>
+      <w:r>
+        <w:t xml:space="preserve">). Nur gleiche strukturvariablen innerhalb von </w:t>
+      </w:r>
+      <w:proofErr w:type="spellStart"/>
+      <w:r>
+        <w:t>berlin</w:t>
+      </w:r>
+      <w:proofErr w:type="spellEnd"/>
+      <w:r>
+        <w:t xml:space="preserve">. Berlin </w:t>
+      </w:r>
+      <w:proofErr w:type="spellStart"/>
+      <w:r>
+        <w:t>nachwahl</w:t>
+      </w:r>
+      <w:proofErr w:type="spellEnd"/>
+      <w:r>
+        <w:t xml:space="preserve"> teils erst 11. Nov.2024 nicht 2021 somit unterschied nur 1 </w:t>
+      </w:r>
+      <w:proofErr w:type="spellStart"/>
+      <w:r>
+        <w:t>jahr</w:t>
+      </w:r>
+      <w:proofErr w:type="spellEnd"/>
+      <w:r>
+        <w:t xml:space="preserve"> -&gt; </w:t>
+      </w:r>
+      <w:proofErr w:type="spellStart"/>
+      <w:r>
+        <w:t>wahlentscheidungen</w:t>
+      </w:r>
+      <w:proofErr w:type="spellEnd"/>
+      <w:r>
+        <w:t xml:space="preserve"> ändern sich </w:t>
+      </w:r>
+      <w:proofErr w:type="spellStart"/>
+      <w:r>
+        <w:t>vllt</w:t>
+      </w:r>
+      <w:proofErr w:type="spellEnd"/>
+      <w:r>
+        <w:t xml:space="preserve"> weniger</w:t>
       </w:r>
     </w:p>
     <w:sectPr>

</xml_diff>

<commit_message>
umbenennung/bezifferung Dateien größere Schrift auf Bildern
</commit_message>
<xml_diff>
--- a/MeinMaterial/Annahmen und begründete Entscheidungen im Projekt.docx
+++ b/MeinMaterial/Annahmen und begründete Entscheidungen im Projekt.docx
@@ -24,8 +24,13 @@
       </w:r>
       <w:proofErr w:type="spellEnd"/>
       <w:r>
-        <w:t>: Es wurde visuell abgecheckt, dass sich keine Flüsse aufheben</w:t>
-      </w:r>
+        <w:t xml:space="preserve">: Es wurde visuell abgecheckt, dass sich keine Flüsse </w:t>
+      </w:r>
+      <w:proofErr w:type="gramStart"/>
+      <w:r>
+        <w:t>aufheben</w:t>
+      </w:r>
+      <w:proofErr w:type="gramEnd"/>
       <w:r>
         <w:br/>
         <w:t xml:space="preserve">12% Hürde, keine </w:t>
@@ -304,10 +309,18 @@
       </w:r>
       <w:proofErr w:type="spellEnd"/>
       <w:r>
-        <w:t xml:space="preserve"> 18) </w:t>
-      </w:r>
-      <w:r>
-        <w:t>: besser/genauer bei weniger Kategorien</w:t>
+        <w:t xml:space="preserve"> 18</w:t>
+      </w:r>
+      <w:proofErr w:type="gramStart"/>
+      <w:r>
+        <w:t xml:space="preserve">) </w:t>
+      </w:r>
+      <w:r>
+        <w:t>:</w:t>
+      </w:r>
+      <w:proofErr w:type="gramEnd"/>
+      <w:r>
+        <w:t xml:space="preserve"> besser/genauer bei weniger Kategorien</w:t>
       </w:r>
       <w:r>
         <w:t xml:space="preserve"> (weniger </w:t>
@@ -655,6 +668,7 @@
         <w:t xml:space="preserve"> </w:t>
       </w:r>
       <w:proofErr w:type="spellStart"/>
+      <w:proofErr w:type="gramStart"/>
       <w:r>
         <w:t>substr</w:t>
       </w:r>
@@ -663,17 +677,27 @@
         <w:t>(</w:t>
       </w:r>
       <w:proofErr w:type="spellStart"/>
+      <w:proofErr w:type="gramEnd"/>
       <w:r>
         <w:t>agg_schluessel</w:t>
       </w:r>
       <w:proofErr w:type="spellEnd"/>
       <w:r>
-        <w:t>, 1, 2) %in% c("12", "13", "14", "15", "16") |</w:t>
+        <w:t xml:space="preserve">, 1, 2) %in% </w:t>
+      </w:r>
+      <w:proofErr w:type="gramStart"/>
+      <w:r>
+        <w:t>c(</w:t>
+      </w:r>
+      <w:proofErr w:type="gramEnd"/>
+      <w:r>
+        <w:t>"12", "13", "14", "15", "16") |</w:t>
       </w:r>
       <w:r>
         <w:t xml:space="preserve"> </w:t>
       </w:r>
       <w:proofErr w:type="spellStart"/>
+      <w:proofErr w:type="gramStart"/>
       <w:r>
         <w:t>substr</w:t>
       </w:r>
@@ -682,6 +706,7 @@
         <w:t>(</w:t>
       </w:r>
       <w:proofErr w:type="spellStart"/>
+      <w:proofErr w:type="gramEnd"/>
       <w:r>
         <w:t>agg_schluessel</w:t>
       </w:r>
@@ -753,7 +778,15 @@
       </w:r>
       <w:proofErr w:type="spellEnd"/>
       <w:r>
-        <w:t xml:space="preserve"> nur sinn bei einem </w:t>
+        <w:t xml:space="preserve"> nur </w:t>
+      </w:r>
+      <w:proofErr w:type="spellStart"/>
+      <w:r>
+        <w:t>sinn</w:t>
+      </w:r>
+      <w:proofErr w:type="spellEnd"/>
+      <w:r>
+        <w:t xml:space="preserve"> bei einem </w:t>
       </w:r>
       <w:proofErr w:type="spellStart"/>
       <w:r>
@@ -838,7 +871,15 @@
       </w:r>
       <w:proofErr w:type="spellEnd"/>
       <w:r>
-        <w:t xml:space="preserve"> (Standard Errors) </w:t>
+        <w:t xml:space="preserve"> (</w:t>
+      </w:r>
+      <w:proofErr w:type="gramStart"/>
+      <w:r>
+        <w:t>Standard Errors</w:t>
+      </w:r>
+      <w:proofErr w:type="gramEnd"/>
+      <w:r>
+        <w:t xml:space="preserve">) </w:t>
       </w:r>
       <w:proofErr w:type="spellStart"/>
       <w:r>
@@ -1005,7 +1046,15 @@
       </w:r>
       <w:proofErr w:type="spellEnd"/>
       <w:r>
-        <w:t xml:space="preserve"> ist nur bester Modellvalidierungswert den wir kriegen, denn </w:t>
+        <w:t xml:space="preserve"> ist nur bester </w:t>
+      </w:r>
+      <w:proofErr w:type="gramStart"/>
+      <w:r>
+        <w:t>Modellvalidierungswert</w:t>
+      </w:r>
+      <w:proofErr w:type="gramEnd"/>
+      <w:r>
+        <w:t xml:space="preserve"> den wir kriegen, denn </w:t>
       </w:r>
       <w:r>
         <w:t>exakt reproduzierte Wahlränder keine korrekten Individualübergänge garantieren und wie unbeobachtete Heterogenität Verzerrungen erzeugt.</w:t>
@@ -1084,7 +1133,14 @@
           <w:lang w:val="en-US"/>
         </w:rPr>
         <w:br/>
-        <w:t xml:space="preserve">In order to facilitate the interpretation of the estimated coefficients and the relative impact of </w:t>
+        <w:t xml:space="preserve">In order to facilitate the interpretation of the estimated coefficients and the relative impact </w:t>
+      </w:r>
+      <w:proofErr w:type="gramStart"/>
+      <w:r>
+        <w:rPr>
+          <w:lang w:val="en-US"/>
+        </w:rPr>
+        <w:t xml:space="preserve">of </w:t>
       </w:r>
       <w:r>
         <w:rPr>
@@ -1096,7 +1152,14 @@
         <w:rPr>
           <w:lang w:val="en-US"/>
         </w:rPr>
-        <w:t>their associated features on accuracy, all the explanatory variables have been standardized t</w:t>
+        <w:t>their</w:t>
+      </w:r>
+      <w:proofErr w:type="gramEnd"/>
+      <w:r>
+        <w:rPr>
+          <w:lang w:val="en-US"/>
+        </w:rPr>
+        <w:t xml:space="preserve"> associated features on accuracy, all the explanatory variables have been standardized t</w:t>
       </w:r>
       <w:r>
         <w:rPr>
@@ -1228,85 +1291,6 @@
       <w:proofErr w:type="spellEnd"/>
       <w:r>
         <w:t>) siehe s.11 unten confounders_ei_history.pdf</w:t>
-      </w:r>
-    </w:p>
-    <w:p>
-      <w:pPr>
-        <w:pStyle w:val="Listenabsatz"/>
-        <w:numPr>
-          <w:ilvl w:val="0"/>
-          <w:numId w:val="1"/>
-        </w:numPr>
-      </w:pPr>
-      <w:r>
-        <w:t xml:space="preserve">Berlin ausschließen: Andere </w:t>
-      </w:r>
-      <w:proofErr w:type="spellStart"/>
-      <w:r>
-        <w:t>strukturen</w:t>
-      </w:r>
-      <w:proofErr w:type="spellEnd"/>
-      <w:r>
-        <w:t xml:space="preserve"> erwartet (</w:t>
-      </w:r>
-      <w:r>
-        <w:t xml:space="preserve">große </w:t>
-      </w:r>
-      <w:proofErr w:type="spellStart"/>
-      <w:r>
-        <w:t>heterogenität</w:t>
-      </w:r>
-      <w:proofErr w:type="spellEnd"/>
-      <w:r>
-        <w:t xml:space="preserve"> innerhalb </w:t>
-      </w:r>
-      <w:proofErr w:type="spellStart"/>
-      <w:r>
-        <w:t>berlin</w:t>
-      </w:r>
-      <w:proofErr w:type="spellEnd"/>
-      <w:r>
-        <w:t xml:space="preserve">). Nur gleiche strukturvariablen innerhalb von </w:t>
-      </w:r>
-      <w:proofErr w:type="spellStart"/>
-      <w:r>
-        <w:t>berlin</w:t>
-      </w:r>
-      <w:proofErr w:type="spellEnd"/>
-      <w:r>
-        <w:t xml:space="preserve">. Berlin </w:t>
-      </w:r>
-      <w:proofErr w:type="spellStart"/>
-      <w:r>
-        <w:t>nachwahl</w:t>
-      </w:r>
-      <w:proofErr w:type="spellEnd"/>
-      <w:r>
-        <w:t xml:space="preserve"> teils erst 11. Nov.2024 nicht 2021 somit unterschied nur 1 </w:t>
-      </w:r>
-      <w:proofErr w:type="spellStart"/>
-      <w:r>
-        <w:t>jahr</w:t>
-      </w:r>
-      <w:proofErr w:type="spellEnd"/>
-      <w:r>
-        <w:t xml:space="preserve"> -&gt; </w:t>
-      </w:r>
-      <w:proofErr w:type="spellStart"/>
-      <w:r>
-        <w:t>wahlentscheidungen</w:t>
-      </w:r>
-      <w:proofErr w:type="spellEnd"/>
-      <w:r>
-        <w:t xml:space="preserve"> ändern sich </w:t>
-      </w:r>
-      <w:proofErr w:type="spellStart"/>
-      <w:r>
-        <w:t>vllt</w:t>
-      </w:r>
-      <w:proofErr w:type="spellEnd"/>
-      <w:r>
-        <w:t xml:space="preserve"> weniger</w:t>
       </w:r>
     </w:p>
     <w:sectPr>

</xml_diff>

<commit_message>
vor server daten push
</commit_message>
<xml_diff>
--- a/MeinMaterial/Annahmen und begründete Entscheidungen im Projekt.docx
+++ b/MeinMaterial/Annahmen und begründete Entscheidungen im Projekt.docx
@@ -24,13 +24,32 @@
       </w:r>
       <w:proofErr w:type="spellEnd"/>
       <w:r>
-        <w:t xml:space="preserve">: Es wurde visuell abgecheckt, dass sich keine Flüsse </w:t>
-      </w:r>
-      <w:proofErr w:type="gramStart"/>
-      <w:r>
-        <w:t>aufheben</w:t>
-      </w:r>
-      <w:proofErr w:type="gramEnd"/>
+        <w:t>: Es wurde visuell abgecheckt, dass sich keine Flüsse aufheben</w:t>
+      </w:r>
+    </w:p>
+    <w:p>
+      <w:pPr>
+        <w:pStyle w:val="Listenabsatz"/>
+      </w:pPr>
+      <w:r>
+        <w:t xml:space="preserve">Also: beide kaum </w:t>
+      </w:r>
+      <w:proofErr w:type="spellStart"/>
+      <w:r>
+        <w:t>üws</w:t>
+      </w:r>
+      <w:proofErr w:type="spellEnd"/>
+      <w:r>
+        <w:t xml:space="preserve"> zu </w:t>
+      </w:r>
+      <w:proofErr w:type="spellStart"/>
+      <w:r>
+        <w:t>afd</w:t>
+      </w:r>
+      <w:proofErr w:type="spellEnd"/>
+      <w:r>
+        <w:t xml:space="preserve">, </w:t>
+      </w:r>
       <w:r>
         <w:br/>
         <w:t xml:space="preserve">12% Hürde, keine </w:t>
@@ -778,15 +797,7 @@
       </w:r>
       <w:proofErr w:type="spellEnd"/>
       <w:r>
-        <w:t xml:space="preserve"> nur </w:t>
-      </w:r>
-      <w:proofErr w:type="spellStart"/>
-      <w:r>
-        <w:t>sinn</w:t>
-      </w:r>
-      <w:proofErr w:type="spellEnd"/>
-      <w:r>
-        <w:t xml:space="preserve"> bei einem </w:t>
+        <w:t xml:space="preserve"> nur sinn bei einem </w:t>
       </w:r>
       <w:proofErr w:type="spellStart"/>
       <w:r>
@@ -956,6 +967,7 @@
       </w:pPr>
       <w:proofErr w:type="spellStart"/>
       <w:r>
+        <w:lastRenderedPageBreak/>
         <w:t>Ecological</w:t>
       </w:r>
       <w:proofErr w:type="spellEnd"/>
@@ -1012,7 +1024,6 @@
       </w:r>
       <w:proofErr w:type="spellStart"/>
       <w:r>
-        <w:lastRenderedPageBreak/>
         <w:t>ecological</w:t>
       </w:r>
       <w:proofErr w:type="spellEnd"/>

</xml_diff>